<commit_message>
feat: finish yesterday's task PM
</commit_message>
<xml_diff>
--- a/IP_KNT-116m_Onyshchenko_15.docx
+++ b/IP_KNT-116m_Onyshchenko_15.docx
@@ -248,15 +248,7 @@
       </w:pPr>
       <w:r>
         <w:rPr/>
-        <w:t>Студент КНТ-</w:t>
-      </w:r>
-      <w:r>
-        <w:rPr/>
-        <w:t>116м</w:t>
-      </w:r>
-      <w:r>
-        <w:rPr/>
-        <w:t xml:space="preserve"> </w:t>
+        <w:t xml:space="preserve">Студент КНТ-116м </w:t>
         <w:tab/>
         <w:tab/>
         <w:tab/>
@@ -1651,12 +1643,12 @@
       <w:lang w:val="en-US" w:eastAsia="uk-UA"/>
     </w:rPr>
   </w:style>
-  <w:style w:type="character" w:styleId="Style12">
-    <w:name w:val="Символ нумерації"/>
+  <w:style w:type="character" w:styleId="user">
+    <w:name w:val="Символ нумерації (user)"/>
     <w:qFormat/>
     <w:rPr/>
   </w:style>
-  <w:style w:type="paragraph" w:styleId="Style13">
+  <w:style w:type="paragraph" w:styleId="Style12">
     <w:name w:val="Заголовок"/>
     <w:basedOn w:val="Normal"/>
     <w:next w:val="BodyText"/>
@@ -1666,7 +1658,7 @@
       <w:spacing w:before="240" w:after="120"/>
     </w:pPr>
     <w:rPr>
-      <w:rFonts w:ascii="Liberation Sans" w:hAnsi="Liberation Sans" w:eastAsia="Microsoft YaHei" w:cs="Lucida Sans"/>
+      <w:rFonts w:ascii="Liberation Sans" w:hAnsi="Liberation Sans" w:eastAsia="Microsoft YaHei" w:cs="Arial Unicode MS"/>
       <w:sz w:val="28"/>
       <w:szCs w:val="28"/>
     </w:rPr>
@@ -1703,7 +1695,7 @@
       <w:szCs w:val="24"/>
     </w:rPr>
   </w:style>
-  <w:style w:type="paragraph" w:styleId="Style14">
+  <w:style w:type="paragraph" w:styleId="Style13">
     <w:name w:val="Покажчик"/>
     <w:basedOn w:val="Normal"/>
     <w:qFormat/>
@@ -1711,10 +1703,10 @@
       <w:suppressLineNumbers/>
     </w:pPr>
     <w:rPr>
-      <w:rFonts w:cs="Lucida Sans"/>
-    </w:rPr>
-  </w:style>
-  <w:style w:type="paragraph" w:styleId="user">
+      <w:rFonts w:cs="Arial Unicode MS"/>
+    </w:rPr>
+  </w:style>
+  <w:style w:type="paragraph" w:styleId="user1">
     <w:name w:val="Заголовок (user)"/>
     <w:basedOn w:val="Normal"/>
     <w:next w:val="BodyText"/>
@@ -1724,12 +1716,12 @@
       <w:spacing w:before="240" w:after="120"/>
     </w:pPr>
     <w:rPr>
-      <w:rFonts w:ascii="Liberation Sans" w:hAnsi="Liberation Sans" w:eastAsia="Microsoft YaHei" w:cs="Arial Unicode MS"/>
+      <w:rFonts w:ascii="Liberation Sans" w:hAnsi="Liberation Sans" w:eastAsia="Microsoft YaHei" w:cs="Lucida Sans"/>
       <w:sz w:val="28"/>
       <w:szCs w:val="28"/>
     </w:rPr>
   </w:style>
-  <w:style w:type="paragraph" w:styleId="user1">
+  <w:style w:type="paragraph" w:styleId="user2">
     <w:name w:val="Покажчик (user)"/>
     <w:basedOn w:val="Normal"/>
     <w:qFormat/>
@@ -1737,12 +1729,12 @@
       <w:suppressLineNumbers/>
     </w:pPr>
     <w:rPr>
-      <w:rFonts w:cs="Arial Unicode MS"/>
+      <w:rFonts w:cs="Lucida Sans"/>
     </w:rPr>
   </w:style>
   <w:style w:type="paragraph" w:styleId="IndexHeading">
     <w:name w:val="index heading"/>
-    <w:basedOn w:val="user"/>
+    <w:basedOn w:val="Style12"/>
     <w:pPr/>
     <w:rPr/>
   </w:style>
@@ -2018,8 +2010,8 @@
     </w:pPr>
     <w:rPr/>
   </w:style>
-  <w:style w:type="numbering" w:styleId="user2" w:default="1">
-    <w:name w:val="Без маркерів (user)"/>
+  <w:style w:type="numbering" w:styleId="Style14" w:default="1">
+    <w:name w:val="Без маркерів"/>
     <w:uiPriority w:val="99"/>
     <w:semiHidden/>
     <w:unhideWhenUsed/>

</xml_diff>